<commit_message>
Allow editing exchange rates in the UI (USD to CZK/EUR)
</commit_message>
<xml_diff>
--- a/README.docx
+++ b/README.docx
@@ -253,7 +253,61 @@
         <w:rPr>
           <w:b w:val="0"/>
         </w:rPr>
-        <w:t>. Všechny ceny se zobrazují ve zvolené měně.</w:t>
+        <w:t xml:space="preserve">. Všechny ceny se zobrazují ve zvolené měně. Kurz lze v UI upravit v poli </w:t>
+      </w:r>
+      <w:r>
+        <w:rPr>
+          <w:b/>
+        </w:rPr>
+        <w:t>„Kurz měny"</w:t>
+      </w:r>
+      <w:r>
+        <w:rPr>
+          <w:b w:val="0"/>
+        </w:rPr>
+        <w:t xml:space="preserve"> (1 USD = CZK / EUR) — hodnota se použije jak pro přepočet tabulek, tak pro ocenění topologie a ceníkových tierů (odesílá se v </w:t>
+      </w:r>
+      <w:r>
+        <w:rPr>
+          <w:rFonts w:ascii="Consolas" w:hAnsi="Consolas"/>
+          <w:b w:val="0"/>
+          <w:sz w:val="19"/>
+        </w:rPr>
+        <w:t>rates</w:t>
+      </w:r>
+      <w:r>
+        <w:rPr>
+          <w:b w:val="0"/>
+        </w:rPr>
+        <w:t xml:space="preserve"> v </w:t>
+      </w:r>
+      <w:r>
+        <w:rPr>
+          <w:rFonts w:ascii="Consolas" w:hAnsi="Consolas"/>
+          <w:b w:val="0"/>
+          <w:sz w:val="19"/>
+        </w:rPr>
+        <w:t>POST /api/advice</w:t>
+      </w:r>
+      <w:r>
+        <w:rPr>
+          <w:b w:val="0"/>
+        </w:rPr>
+        <w:t xml:space="preserve"> a </w:t>
+      </w:r>
+      <w:r>
+        <w:rPr>
+          <w:rFonts w:ascii="Consolas" w:hAnsi="Consolas"/>
+          <w:b w:val="0"/>
+          <w:sz w:val="19"/>
+        </w:rPr>
+        <w:t>POST /api/topology/price</w:t>
+      </w:r>
+      <w:r>
+        <w:rPr>
+          <w:b w:val="0"/>
+        </w:rPr>
+        <w:t>).</w:t>
       </w:r>
     </w:p>
     <w:p>

</xml_diff>

<commit_message>
Exchange rate editor: replace USD/EUR input with EUR to CZK
</commit_message>
<xml_diff>
--- a/README.docx
+++ b/README.docx
@@ -265,7 +265,31 @@
         <w:rPr>
           <w:b w:val="0"/>
         </w:rPr>
-        <w:t xml:space="preserve"> (1 USD = CZK / EUR) — hodnota se použije jak pro přepočet tabulek, tak pro ocenění topologie a ceníkových tierů (odesílá se v </w:t>
+        <w:t xml:space="preserve"> (zadává se </w:t>
+      </w:r>
+      <w:r>
+        <w:rPr>
+          <w:b/>
+        </w:rPr>
+        <w:t>1 USD = X CZK</w:t>
+      </w:r>
+      <w:r>
+        <w:rPr>
+          <w:b w:val="0"/>
+        </w:rPr>
+        <w:t xml:space="preserve"> a </w:t>
+      </w:r>
+      <w:r>
+        <w:rPr>
+          <w:b/>
+        </w:rPr>
+        <w:t>1 EUR = X CZK</w:t>
+      </w:r>
+      <w:r>
+        <w:rPr>
+          <w:b w:val="0"/>
+        </w:rPr>
+        <w:t xml:space="preserve">, euro se interně přepočte na USD base) — hodnota se použije jak pro přepočet tabulek, tak pro ocenění topologie a ceníkových tierů (odesílá se v </w:t>
       </w:r>
       <w:r>
         <w:rPr>

</xml_diff>